<commit_message>
backup: MTD sales monitor 2026-09-13
</commit_message>
<xml_diff>
--- a/McFarlane_DC_Sales_Alerts_PRD.docx
+++ b/McFarlane_DC_Sales_Alerts_PRD.docx
@@ -17,12 +17,12 @@
     </w:p>
     <w:p>
       <w:r>
-        <w:t xml:space="preserve">Last updated: 2026-09-12 EDT  </w:t>
+        <w:t xml:space="preserve">Last updated: 2026-09-13 EDT  </w:t>
       </w:r>
     </w:p>
     <w:p>
       <w:r>
-        <w:t xml:space="preserve">Implementation signature: `5e51c83090e3`  </w:t>
+        <w:t xml:space="preserve">Implementation signature: `9cec269edda5`  </w:t>
       </w:r>
     </w:p>
     <w:p>

</xml_diff>

<commit_message>
backup: MTD sales monitor 2026-09-14
</commit_message>
<xml_diff>
--- a/McFarlane_DC_Sales_Alerts_PRD.docx
+++ b/McFarlane_DC_Sales_Alerts_PRD.docx
@@ -17,12 +17,12 @@
     </w:p>
     <w:p>
       <w:r>
-        <w:t xml:space="preserve">Last updated: 2026-09-13 EDT  </w:t>
+        <w:t xml:space="preserve">Last updated: 2026-09-14 EDT  </w:t>
       </w:r>
     </w:p>
     <w:p>
       <w:r>
-        <w:t xml:space="preserve">Implementation signature: `9cec269edda5`  </w:t>
+        <w:t xml:space="preserve">Implementation signature: `8d6fcd5eaf03`  </w:t>
       </w:r>
     </w:p>
     <w:p>

</xml_diff>

<commit_message>
backup: sales source snapshot 2026-09-16
</commit_message>
<xml_diff>
--- a/McFarlane_DC_Sales_Alerts_PRD.docx
+++ b/McFarlane_DC_Sales_Alerts_PRD.docx
@@ -7,32 +7,32 @@
         <w:pStyle w:val="Title"/>
       </w:pPr>
       <w:r>
-        <w:t>Product Requirements Document — McFarlane DC Completed-Sale Alerts</w:t>
+        <w:t>Product Requirements Document — MTD Completed-Sale Alerts (all approved categories)</w:t>
       </w:r>
     </w:p>
     <w:p>
       <w:r>
-        <w:t xml:space="preserve">Version: 1.1  </w:t>
+        <w:t>Version: 2.0</w:t>
       </w:r>
     </w:p>
     <w:p>
       <w:r>
-        <w:t xml:space="preserve">Last updated: 2026-09-14 EDT  </w:t>
+        <w:t>Agent source audit: 2026-09-16; local code and recurring configuration only, no human approval, API or outbound test implied.</w:t>
       </w:r>
     </w:p>
     <w:p>
       <w:r>
-        <w:t xml:space="preserve">Implementation signature: `8d6fcd5eaf03`  </w:t>
+        <w:t>Status: Active; known coverage/delivery limitations below.</w:t>
       </w:r>
     </w:p>
     <w:p>
       <w:r>
-        <w:t xml:space="preserve">Status: Active  </w:t>
+        <w:t>Compatibility filename: McFarlane_DC_Sales_Alerts_PRD. The DC filename no longer describes the entire scope.</w:t>
       </w:r>
     </w:p>
     <w:p>
       <w:r>
-        <w:t>Private state: `C:/Users/jltfo/AppData/Local/hermes/price-watches/mcfarlane-dc-sales.json`</w:t>
+        <w:t>Private state: HERMES_HOME/price-watches/mcfarlane-dc-sales.json (not backed up).</w:t>
       </w:r>
     </w:p>
     <w:p>
@@ -40,12 +40,52 @@
         <w:pStyle w:val="Heading1"/>
       </w:pPr>
       <w:r>
-        <w:t>Purpose</w:t>
+        <w:t>Purpose, scope and schedule</w:t>
       </w:r>
     </w:p>
     <w:p>
       <w:r>
-        <w:t>Detect newly completed McFarlane DC marketplace sales across the configured storefront collection allowlist. Discord receives a reliable result for each primary interval; WhatsApp receives only actual, newly verified completed-sale events.</w:t>
+        <w:t>Detect newly completed marketplace sales within the approved private allowlist, independently of the smaller Exotic listings watch. Current saved scope is 121 collections: DC 70, Spawn 20, UFC 12, Universal 7, McFarlane Dragons 7, Walking Dead 2, McFarlane Digital 2 and BRZRKR 1. These counts describe inspected configuration, not independently validated live market coverage.</w:t>
+      </w:r>
+    </w:p>
+    <w:p>
+      <w:pPr>
+        <w:pStyle w:val="ListBullet"/>
+      </w:pPr>
+      <w:r>
+        <w:t>Primary no-agent job invokes scripts/run_mtd_sales_monitor.py, which executes price-watches/run_mcfarlane_dc_sales.py. The similarly named legacy run_mcfarlane_dc_monitor.py is not the primary runtime.</w:t>
+      </w:r>
+    </w:p>
+    <w:p>
+      <w:pPr>
+        <w:pStyle w:val="ListBullet"/>
+      </w:pPr>
+      <w:r>
+        <w:t>Primary checks: 00:00, 08:00, 12:00, 16:00 and 20:00 America/New_York.</w:t>
+      </w:r>
+    </w:p>
+    <w:p>
+      <w:pPr>
+        <w:pStyle w:val="ListBullet"/>
+      </w:pPr>
+      <w:r>
+        <w:t>Saved-state-only WhatsApp stage runs at minute 15 of those hours. HTTP-400 retry and one-collection metadata enrichment poll every five minutes.</w:t>
+      </w:r>
+    </w:p>
+    <w:p>
+      <w:pPr>
+        <w:pStyle w:val="ListBullet"/>
+      </w:pPr>
+      <w:r>
+        <w:t>A separate saved-state last-five heartbeat runs at 08:05, gated on last_successful_check_at being today in hour 08. It does not validate an actual primary execution-ledger occurrence or maintain owed/replay state. If the check completes after the scheduled heartbeat, a later automatic catch-up is not implemented by this script.</w:t>
+      </w:r>
+    </w:p>
+    <w:p>
+      <w:pPr>
+        <w:pStyle w:val="ListBullet"/>
+      </w:pPr>
+      <w:r>
+        <w:t>One-off samples/reviews are not recurring requirements and are excluded from restore schedules.</w:t>
       </w:r>
     </w:p>
     <w:p>
@@ -53,7 +93,30 @@
         <w:pStyle w:val="Heading1"/>
       </w:pPr>
       <w:r>
-        <w:t>Scope and schedule</w:t>
+        <w:t>Actual collection implementation</w:t>
+      </w:r>
+    </w:p>
+    <w:p>
+      <w:r>
+        <w:t>The primary calls Rarible POST /v0.1/activities/search with POLYGON, SELL, the exact collection-ID strings, LATEST ordering, size 1000 and a baseline-date from field. Credentials come only from RARIBLE_API_KEY; browser-like User-Agent and Accept headers are sent. Missing credentials, HTTP failures or an absent activities array retain saved data and return silent output.</w:t>
+      </w:r>
+    </w:p>
+    <w:p>
+      <w:r>
+        <w:t>Returned records are accepted only when type is exactly SELL, not reverted, in the allowlist and not already known by activity ID. Category and per-collection onboarding dates suppress older history. Query-local records are also deduplicated. Recent history is bounded to 10 records in the inspected source; the oldest-first new batch updates collection last_sale and the pending WhatsApp batch.</w:t>
+      </w:r>
+    </w:p>
+    <w:p>
+      <w:r>
+        <w:t>Item metadata supplies item name and the exact Rarity attribute; failures degrade to Unknown rather than aborting a valid sale. Missing collection display names get a best-effort priority lookup, falling back to the collection identifier. Buyer and seller wallets remain private; local unique aliases are preferred for display, otherwise only a nine-character wallet suffix is shown. Metadata lookups use 10-second sleeps in the current primary, not a universal 15-second marketplace pacing guarantee.</w:t>
+      </w:r>
+    </w:p>
+    <w:p>
+      <w:pPr>
+        <w:pStyle w:val="Heading1"/>
+      </w:pPr>
+      <w:r>
+        <w:t>Known correctness limits — do not describe as complete coverage</w:t>
       </w:r>
     </w:p>
     <w:p>
@@ -61,7 +124,7 @@
         <w:pStyle w:val="ListBullet"/>
       </w:pPr>
       <w:r>
-        <w:t>Main completed-sale check: 00:00, 08:00, 12:00, 16:00, and 20:00 Eastern.</w:t>
+        <w:t>The actual primary performs ONE activity page request. It does not follow a continuation cursor or prove page exhaustion. More than 1000 matching events can be missed; the saved cursor field is not evidence of pagination.</w:t>
       </w:r>
     </w:p>
     <w:p>
@@ -69,7 +132,7 @@
         <w:pStyle w:val="ListBullet"/>
       </w:pPr>
       <w:r>
-        <w:t>WhatsApp sales-only delivery: 15 minutes after every main interval.</w:t>
+        <w:t>The primary accepts only top-level SELL. Accepted bids are covered only if the provider represents completion as SELL; independent ACCEPT_BID record coverage is not implemented here.</w:t>
       </w:r>
     </w:p>
     <w:p>
@@ -77,7 +140,7 @@
         <w:pStyle w:val="ListBullet"/>
       </w:pPr>
       <w:r>
-        <w:t>The full collection allowlist is held privately in the state file.</w:t>
+        <w:t>The code does not advance baseline.newest_sale after the batch. It relies on initial/category baselines and the recent 10-event ID window; older events outside that window can be reconsidered when returned. A robust persisted pagination/watermark/overlap contract remains required.</w:t>
       </w:r>
     </w:p>
     <w:p>
@@ -85,7 +148,7 @@
         <w:pStyle w:val="ListBullet"/>
       </w:pPr>
       <w:r>
-        <w:t>Completed sales are authoritative from Rarible Activities, not mutable order listings.</w:t>
+        <w:t>Every rendered primary sale line labels price POL without validating the payment asset. Non-POL sales can be mislabeled. Quantity is saved but omitted in the current outbound line. Time is a truncated API date string, without an explicit timezone label.</w:t>
       </w:r>
     </w:p>
     <w:p>
@@ -93,7 +156,23 @@
         <w:pStyle w:val="ListBullet"/>
       </w:pPr>
       <w:r>
-        <w:t>Mints, transfers, reverted events, and already-known activity IDs are excluded.</w:t>
+        <w:t>Metadata failure does not invalidate the sale; therefore the previous PRD claim that any metadata failure retains the entire baseline was inaccurate. Collection fallback can expose a contract ID instead of a friendly pending-name label.</w:t>
+      </w:r>
+    </w:p>
+    <w:p>
+      <w:pPr>
+        <w:pStyle w:val="ListBullet"/>
+      </w:pPr>
+      <w:r>
+        <w:t>Sales primary, retry, metadata and downstream writers use atomic replacement but do not share the Exotic execution lease. Overlapping read-modify-write operations can lose updates.</w:t>
+      </w:r>
+    </w:p>
+    <w:p>
+      <w:pPr>
+        <w:pStyle w:val="ListBullet"/>
+      </w:pPr>
+      <w:r>
+        <w:t>A new batch overwrites pending_whatsapp_sale_alert rather than merging all undelivered events. Delivery consumption is not an acknowledged outbox transaction; failed scheduler delivery can lose replay and overlapping batches can overwrite pending events.</w:t>
       </w:r>
     </w:p>
     <w:p>
@@ -101,79 +180,17 @@
         <w:pStyle w:val="Heading1"/>
       </w:pPr>
       <w:r>
-        <w:t>Data source and collection procedure</w:t>
+        <w:t>Retry and enrichment</w:t>
       </w:r>
     </w:p>
     <w:p>
-      <w:pPr>
-        <w:pStyle w:val="ListNumber"/>
-      </w:pPr>
       <w:r>
-        <w:t>Read the saved baseline activity and collection allowlist from private state.</w:t>
+        <w:t>On an HTTP 400 the primary creates a five-minute due marker with three attempts. The gated retry runner is silent when no marker is due and passes MTD_HTTP400_RETRY=1; each failed retry decrements the budget. A valid parsed activities response clears the marker. Exhaustion removes it, so no automatic retry is due until a later primary failure creates a new budget. This differs from Exotic's retained generation-scoped exhausted marker. Other errors do not create this HTTP-400 budget.</w:t>
       </w:r>
     </w:p>
     <w:p>
-      <w:pPr>
-        <w:pStyle w:val="ListNumber"/>
-      </w:pPr>
       <w:r>
-        <w:t>Query `POST /v0.1/activities/search` with the saved collection-ID strings, `POLYGON`, type `SELL`, newest-first ordering, and the baseline date.</w:t>
-      </w:r>
-    </w:p>
-    <w:p>
-      <w:pPr>
-        <w:pStyle w:val="ListNumber"/>
-      </w:pPr>
-      <w:r>
-        <w:t>Send the configured Rarible API key only as an API header; never write, log, or publish it.</w:t>
-      </w:r>
-    </w:p>
-    <w:p>
-      <w:pPr>
-        <w:pStyle w:val="ListNumber"/>
-      </w:pPr>
-      <w:r>
-        <w:t>Require a successful, complete, parseable response before changing state or sending a Discord heartbeat.</w:t>
-      </w:r>
-    </w:p>
-    <w:p>
-      <w:pPr>
-        <w:pStyle w:val="ListNumber"/>
-      </w:pPr>
-      <w:r>
-        <w:t>Deduplicate new activity by activity ID and ignore reverted activity.</w:t>
-      </w:r>
-    </w:p>
-    <w:p>
-      <w:pPr>
-        <w:pStyle w:val="ListNumber"/>
-      </w:pPr>
-      <w:r>
-        <w:t>For each new sale, fetch item metadata serially with a measured 10-second gap between metadata requests.</w:t>
-      </w:r>
-    </w:p>
-    <w:p>
-      <w:pPr>
-        <w:pStyle w:val="ListNumber"/>
-      </w:pPr>
-      <w:r>
-        <w:t>Use the item metadata attribute whose key is exactly `Rarity`; report `Unknown` when unavailable rather than inferring rarity.</w:t>
-      </w:r>
-    </w:p>
-    <w:p>
-      <w:pPr>
-        <w:pStyle w:val="ListNumber"/>
-      </w:pPr>
-      <w:r>
-        <w:t>Preserve the normalized buyer wallet from the Rarible activity, then resolve a buyer Name Tag only when exactly one local PolygonScan alias record matches the wallet.</w:t>
-      </w:r>
-    </w:p>
-    <w:p>
-      <w:pPr>
-        <w:pStyle w:val="ListNumber"/>
-      </w:pPr>
-      <w:r>
-        <w:t>Atomically update recent-sale history, collection last-sale data, baseline, and a pending WhatsApp sale event.</w:t>
+        <w:t>The metadata worker handles one pending eligible collection per tick, prioritizing collections referenced by sale records/queues before catalog-only work. A failure cools that collection down; no pending work means no request. It writes state and a readable metadata progress report. Private category onboarding baselines must be restored or rebuilt silently before enabling alerts for a category.</w:t>
       </w:r>
     </w:p>
     <w:p>
@@ -181,63 +198,17 @@
         <w:pStyle w:val="Heading1"/>
       </w:pPr>
       <w:r>
-        <w:t>Last-purchase history</w:t>
+        <w:t>USD valuation and privacy</w:t>
       </w:r>
     </w:p>
     <w:p>
-      <w:pPr>
-        <w:pStyle w:val="ListBullet"/>
-      </w:pPr>
       <w:r>
-        <w:t>Private sale history retains both `buyer_wallet` and, where a unique local match exists, `buyer_name_tag`.</w:t>
+        <w:t>The primary persists API priceUsd, falling back to amountUsd, then an already-cached date-keyed POL/USD rate. It does not fetch missing historical rates itself. The older cache_mcfarlane_sale_usd.py is an unscheduled one-off migration containing embedded historic event mappings and touching both monitors, not a general rate fetcher or runtime dependency; it is deliberately excluded from source-only backups. A missing rate produces USD unavailable. Historical sale USD must not be repriced from current spot.</w:t>
       </w:r>
     </w:p>
     <w:p>
-      <w:pPr>
-        <w:pStyle w:val="ListBullet"/>
-      </w:pPr>
       <w:r>
-        <w:t>A saved Name Tag is preferred in history displays; otherwise the saved buyer wallet is used. Missing historical buyer data is rendered as `Buyer not recorded` rather than inferred.</w:t>
-      </w:r>
-    </w:p>
-    <w:p>
-      <w:pPr>
-        <w:pStyle w:val="ListBullet"/>
-      </w:pPr>
-      <w:r>
-        <w:t>Alias resolution is local-only: exact wallet aliases take precedence, then a unique case-insensitive masked-address prefix/suffix match. Ambiguous or unmatched records are never assigned a Name Tag.</w:t>
-      </w:r>
-    </w:p>
-    <w:p>
-      <w:pPr>
-        <w:pStyle w:val="Heading1"/>
-      </w:pPr>
-      <w:r>
-        <w:t>Failure handling</w:t>
-      </w:r>
-    </w:p>
-    <w:p>
-      <w:pPr>
-        <w:pStyle w:val="ListBullet"/>
-      </w:pPr>
-      <w:r>
-        <w:t>HTTP failure, malformed/incomplete response, missing API access, or metadata failure retains existing sale history and baseline.</w:t>
-      </w:r>
-    </w:p>
-    <w:p>
-      <w:pPr>
-        <w:pStyle w:val="ListBullet"/>
-      </w:pPr>
-      <w:r>
-        <w:t>Failed/incomplete checks do not produce a Discord no-sale heartbeat or WhatsApp alert.</w:t>
-      </w:r>
-    </w:p>
-    <w:p>
-      <w:pPr>
-        <w:pStyle w:val="ListBullet"/>
-      </w:pPr>
-      <w:r>
-        <w:t>A successful no-sale check updates only its successful-check timestamp and sends the configured one-line Discord heartbeat.</w:t>
+        <w:t>Raw wallets, aliases, Name Tags, delivery destinations, API credentials and raw activity payloads are private. Backup policy is now source-only rather than recursive field removal from raw state: arbitrary provider payloads can hide identities in unexpected nested fields, so denylist scrubbing is not sufficient.</w:t>
       </w:r>
     </w:p>
     <w:p>
@@ -250,15 +221,10 @@
     </w:p>
     <w:p>
       <w:pPr>
-        <w:pStyle w:val="Heading2"/>
+        <w:pStyle w:val="ListBullet"/>
       </w:pPr>
       <w:r>
-        <w:t>Discord</w:t>
-      </w:r>
-    </w:p>
-    <w:p>
-      <w:r>
-        <w:t>A successful primary run always reports either:</w:t>
+        <w:t>Successful primary no-sale result prints a short Discord status (the installed string still says MTD DC Sales Alert despite expanded scope). Failed checks are silent rather than successful heartbeats.</w:t>
       </w:r>
     </w:p>
     <w:p>
@@ -266,7 +232,7 @@
         <w:pStyle w:val="ListBullet"/>
       </w:pPr>
       <w:r>
-        <w:t>one line confirming no new completed sales; or</w:t>
+        <w:t>New sales are aggregated into one message with one CRLF-separated line per sale, category, collection, item, rarity, price/USD, masked buyer/seller and sale time. The current omissions/mislabeling risks are listed above, not represented as fulfilled requirements.</w:t>
       </w:r>
     </w:p>
     <w:p>
@@ -274,25 +240,15 @@
         <w:pStyle w:val="ListBullet"/>
       </w:pPr>
       <w:r>
-        <w:t>one aggregate message containing every newly found sale, one CRLF-terminated physical line per sale.</w:t>
-      </w:r>
-    </w:p>
-    <w:p>
-      <w:r>
-        <w:t>A sale line includes collection display name, item name, verified rarity or `Unknown`, price/payment asset, sale time, and buyer identity. A uniquely resolved Name Tag is preferred; an unmatched wallet is privacy-masked in outbound alerts.</w:t>
+        <w:t>WhatsApp reads pending state only, adds the MTD Sales Alert heading and remains silent without undelivered activity. It makes no marketplace request.</w:t>
       </w:r>
     </w:p>
     <w:p>
       <w:pPr>
-        <w:pStyle w:val="Heading2"/>
+        <w:pStyle w:val="ListBullet"/>
       </w:pPr>
       <w:r>
-        <w:t>WhatsApp</w:t>
-      </w:r>
-    </w:p>
-    <w:p>
-      <w:r>
-        <w:t>The downstream job reads only the pending state event. It sends one aggregated alert only for undelivered sale IDs, marks that event delivered atomically, and otherwise returns `[SILENT]`. It never sends a no-activity status.</w:t>
+        <w:t>The independent 08:05 saved last-five heartbeat is not a new-sale alert. It renders at most five recent saved sales and may show older history; it is not a live last-five query.</w:t>
       </w:r>
     </w:p>
     <w:p>
@@ -300,44 +256,47 @@
         <w:pStyle w:val="Heading1"/>
       </w:pPr>
       <w:r>
-        <w:t>Security and privacy</w:t>
-      </w:r>
-    </w:p>
-    <w:p>
-      <w:pPr>
-        <w:pStyle w:val="ListBullet"/>
-      </w:pPr>
-      <w:r>
-        <w:t>Rarible credentials stay in runtime secret configuration only.</w:t>
-      </w:r>
-    </w:p>
-    <w:p>
-      <w:pPr>
-        <w:pStyle w:val="ListBullet"/>
-      </w:pPr>
-      <w:r>
-        <w:t>State and backup handling exclude credentials and delivery identities.</w:t>
-      </w:r>
-    </w:p>
-    <w:p>
-      <w:pPr>
-        <w:pStyle w:val="ListBullet"/>
-      </w:pPr>
-      <w:r>
-        <w:t>Public reports do not expose internal baseline IDs, API credentials, or diagnostic logs. Raw buyer wallets remain private-state data; outbound alerts use a verified Name Tag where available or a privacy-masked wallet suffix.</w:t>
-      </w:r>
-    </w:p>
-    <w:p>
-      <w:pPr>
-        <w:pStyle w:val="Heading1"/>
-      </w:pPr>
-      <w:r>
-        <w:t>Backup and review</w:t>
+        <w:t>Source-only backup and restore</w:t>
       </w:r>
     </w:p>
     <w:p>
       <w:r>
-        <w:t>The daily MTD backup refreshes this PRD before evaluating backup changes, then includes this Markdown PRD and its DOCX counterpart in the same once-per-Eastern-day commit/push policy. It copies only whitelisted, non-secret monitor artifacts.</w:t>
+        <w:t>The explicit manifest now includes the actual primary Python wrapper and collector, HTTP-400 retry, WhatsApp downstream, 08:05 heartbeat, metadata worker, shared backup/PRD automation and offline tests. RESTORE.md and restore-config.json supply dependency requirements, relocation placeholders and disabled recurring schedules. They intentionally exclude exact roster/contracts, baseline/history, raw activity state, wallet aliases, delivery IDs, credentials, private URLs, logs, environments and browser profiles.</w:t>
+      </w:r>
+    </w:p>
+    <w:p>
+      <w:r>
+        <w:t>Restore requires Python 3.11+, the declared packages, Hermes and separately supplied private state or an explicitly approved silent rebaseline. Alias and daily-rate JSON files must exist (empty structures are acceptable for degraded display). Preserve private dedupe/pending state only through a separate trusted recovery process; do not replay history as new sales. No scheduled live test was performed for this review.</w:t>
+      </w:r>
+    </w:p>
+    <w:p>
+      <w:r>
+        <w:t>Daily backup detects identical source snapshots, enforces one ET-day success/push-attempt cap before staging, refuses dirty or legacy-data-bearing repositories, stages only explicit files, and verifies a successful push against the remote commit. Existing git history is not sanitized by creating a new source snapshot. PRD automation records drift using all manifest sources and stable relevant schedule/scope semantics plus allowlisted policy declarations; changed hashes are not a substantive review and declarations may lag implementation. DOCX follows Markdown content, not volatile scheduler telemetry. Snapshot verification rejects unlisted files and scans DOCX text, metadata and external relationships.</w:t>
+      </w:r>
+    </w:p>
+    <w:p>
+      <w:r>
+        <w:t>The enabled daily backup remains at 23:50 America/New_York. The inspected repository still contains tracked legacy monitor data and an untracked metadata script. The source-only backup intentionally refuses this repository until the owner reviews/quarantines legacy files and cleans the worktree. No automatic cleanup, history rewrite or remote push was performed by this offline audit.</w:t>
+      </w:r>
+    </w:p>
+    <w:p>
+      <w:r>
+        <w:t>&lt;!-- automated-drift:start --&gt;</w:t>
+      </w:r>
+    </w:p>
+    <w:p>
+      <w:r>
+        <w:t>Observed implementation fingerprint: `169e10be41cff608579b5eaf58dcb69cadebcfcbd571c0dbe0598bcdb0a39cb2`</w:t>
+      </w:r>
+    </w:p>
+    <w:p>
+      <w:r>
+        <w:t>Automated drift status: changed or unreviewed; substantive review required. Hash comparison is not a requirements review.</w:t>
+      </w:r>
+    </w:p>
+    <w:p>
+      <w:r>
+        <w:t>&lt;!-- automated-drift:end --&gt;</w:t>
       </w:r>
     </w:p>
     <w:sectPr>

</xml_diff>

<commit_message>
backup: sales source snapshot 2026-09-23
</commit_message>
<xml_diff>
--- a/McFarlane_DC_Sales_Alerts_PRD.docx
+++ b/McFarlane_DC_Sales_Alerts_PRD.docx
@@ -108,7 +108,7 @@
     </w:p>
     <w:p>
       <w:r>
-        <w:t>Item metadata supplies item name and the exact Rarity attribute; failures degrade to Unknown rather than aborting a valid sale. Missing collection display names get a best-effort priority lookup, falling back to the collection identifier. Buyer and seller wallets remain private; local unique aliases are preferred for display, otherwise only a nine-character wallet suffix is shown. Metadata lookups use 10-second sleeps in the current primary, not a universal 15-second marketplace pacing guarantee.</w:t>
+        <w:t>Item metadata supplies item name and the exact Rarity attribute; failures degrade to Unknown rather than aborting a valid sale. Missing collection display names get a best-effort priority lookup, falling back to the collection identifier. Buyer and seller wallets remain private; local unique aliases from the canonical `mcfarlane-wallet-aliases.json` database shared with Exotic and tracked-wallet monitors are preferred for display, otherwise only a nine-character wallet suffix is shown. The saved-state-only recurring-wallet audit reports distinct repeated wallets still unresolved by that database without making marketplace or notification calls. Metadata lookups use 10-second sleeps in the current primary, not a universal 15-second marketplace pacing guarantee.</w:t>
       </w:r>
     </w:p>
     <w:p>
@@ -286,7 +286,7 @@
     </w:p>
     <w:p>
       <w:r>
-        <w:t>Observed implementation fingerprint: `bbb538c53cd54a7d32e43db99c1f86b2bdc08d4ee8a820db2305fa1ff68e5c86`</w:t>
+        <w:t>Observed implementation fingerprint: `73916797a33a29296188e326c55155fe12bd9812eb4654c71e21cd68f301ddec`</w:t>
       </w:r>
     </w:p>
     <w:p>

</xml_diff>